<commit_message>
Fixes in lithuanians collection introduction
</commit_message>
<xml_diff>
--- a/nationalities/lithuanians/lithuanians.docx
+++ b/nationalities/lithuanians/lithuanians.docx
@@ -347,7 +347,6 @@
                       <w:rFonts w:ascii="Arial Black" w:hAnsi="Arial Black"/>
                       <w:sz w:val="28"/>
                       <w:szCs w:val="28"/>
-                      <w:lang w:val="en-US"/>
                     </w:rPr>
                   </w:pPr>
                   <w:r>
@@ -373,9 +372,8 @@
                       <w:rFonts w:ascii="Arial Black" w:hAnsi="Arial Black"/>
                       <w:sz w:val="28"/>
                       <w:szCs w:val="28"/>
-                      <w:lang w:val="en-US"/>
                     </w:rPr>
-                    <w:t>7</w:t>
+                    <w:t>9</w:t>
                   </w:r>
                 </w:p>
               </w:tc>
@@ -452,7 +450,7 @@
           <w:r>
             <w:fldChar w:fldCharType="separate"/>
           </w:r>
-          <w:hyperlink w:anchor="_Toc120402825" w:history="1">
+          <w:hyperlink w:anchor="_Toc120460903" w:history="1">
             <w:r>
               <w:rPr>
                 <w:rStyle w:val="Hyperlink"/>
@@ -480,7 +478,7 @@
                 <w:noProof/>
                 <w:webHidden/>
               </w:rPr>
-              <w:instrText xml:space="preserve"> PAGEREF _Toc120402825 \h </w:instrText>
+              <w:instrText xml:space="preserve"> PAGEREF _Toc120460903 \h </w:instrText>
             </w:r>
             <w:r>
               <w:rPr>
@@ -524,7 +522,7 @@
               <w:lang w:val="en-US"/>
             </w:rPr>
           </w:pPr>
-          <w:hyperlink w:anchor="_Toc120402826" w:history="1">
+          <w:hyperlink w:anchor="_Toc120460904" w:history="1">
             <w:r>
               <w:rPr>
                 <w:rStyle w:val="Hyperlink"/>
@@ -552,7 +550,7 @@
                 <w:noProof/>
                 <w:webHidden/>
               </w:rPr>
-              <w:instrText xml:space="preserve"> PAGEREF _Toc120402826 \h </w:instrText>
+              <w:instrText xml:space="preserve"> PAGEREF _Toc120460904 \h </w:instrText>
             </w:r>
             <w:r>
               <w:rPr>
@@ -596,7 +594,7 @@
               <w:lang w:val="en-US"/>
             </w:rPr>
           </w:pPr>
-          <w:hyperlink w:anchor="_Toc120402827" w:history="1">
+          <w:hyperlink w:anchor="_Toc120460905" w:history="1">
             <w:r>
               <w:rPr>
                 <w:rStyle w:val="Hyperlink"/>
@@ -624,7 +622,7 @@
                 <w:noProof/>
                 <w:webHidden/>
               </w:rPr>
-              <w:instrText xml:space="preserve"> PAGEREF _Toc120402827 \h </w:instrText>
+              <w:instrText xml:space="preserve"> PAGEREF _Toc120460905 \h </w:instrText>
             </w:r>
             <w:r>
               <w:rPr>
@@ -668,7 +666,7 @@
               <w:lang w:val="en-US"/>
             </w:rPr>
           </w:pPr>
-          <w:hyperlink w:anchor="_Toc120402828" w:history="1">
+          <w:hyperlink w:anchor="_Toc120460906" w:history="1">
             <w:r>
               <w:rPr>
                 <w:rStyle w:val="Hyperlink"/>
@@ -695,7 +693,7 @@
                 <w:noProof/>
                 <w:webHidden/>
               </w:rPr>
-              <w:instrText xml:space="preserve"> PAGEREF _Toc120402828 \h </w:instrText>
+              <w:instrText xml:space="preserve"> PAGEREF _Toc120460906 \h </w:instrText>
             </w:r>
             <w:r>
               <w:rPr>
@@ -737,7 +735,7 @@
               <w:lang w:val="en-US" w:eastAsia="en-US"/>
             </w:rPr>
           </w:pPr>
-          <w:hyperlink w:anchor="_Toc120402829" w:history="1">
+          <w:hyperlink w:anchor="_Toc120460907" w:history="1">
             <w:r>
               <w:rPr>
                 <w:rStyle w:val="Hyperlink"/>
@@ -765,7 +763,7 @@
                 <w:noProof/>
                 <w:webHidden/>
               </w:rPr>
-              <w:instrText xml:space="preserve"> PAGEREF _Toc120402829 \h </w:instrText>
+              <w:instrText xml:space="preserve"> PAGEREF _Toc120460907 \h </w:instrText>
             </w:r>
             <w:r>
               <w:rPr>
@@ -807,7 +805,7 @@
               <w:lang w:val="en-US" w:eastAsia="en-US"/>
             </w:rPr>
           </w:pPr>
-          <w:hyperlink w:anchor="_Toc120402830" w:history="1">
+          <w:hyperlink w:anchor="_Toc120460908" w:history="1">
             <w:r>
               <w:rPr>
                 <w:rStyle w:val="Hyperlink"/>
@@ -835,7 +833,7 @@
                 <w:noProof/>
                 <w:webHidden/>
               </w:rPr>
-              <w:instrText xml:space="preserve"> PAGEREF _Toc120402830 \h </w:instrText>
+              <w:instrText xml:space="preserve"> PAGEREF _Toc120460908 \h </w:instrText>
             </w:r>
             <w:r>
               <w:rPr>
@@ -877,7 +875,7 @@
               <w:lang w:val="en-US" w:eastAsia="en-US"/>
             </w:rPr>
           </w:pPr>
-          <w:hyperlink w:anchor="_Toc120402831" w:history="1">
+          <w:hyperlink w:anchor="_Toc120460909" w:history="1">
             <w:r>
               <w:rPr>
                 <w:rStyle w:val="Hyperlink"/>
@@ -904,7 +902,7 @@
                 <w:noProof/>
                 <w:webHidden/>
               </w:rPr>
-              <w:instrText xml:space="preserve"> PAGEREF _Toc120402831 \h </w:instrText>
+              <w:instrText xml:space="preserve"> PAGEREF _Toc120460909 \h </w:instrText>
             </w:r>
             <w:r>
               <w:rPr>
@@ -946,7 +944,7 @@
               <w:lang w:val="en-US" w:eastAsia="en-US"/>
             </w:rPr>
           </w:pPr>
-          <w:hyperlink w:anchor="_Toc120402832" w:history="1">
+          <w:hyperlink w:anchor="_Toc120460910" w:history="1">
             <w:r>
               <w:rPr>
                 <w:rStyle w:val="Hyperlink"/>
@@ -973,7 +971,7 @@
                 <w:noProof/>
                 <w:webHidden/>
               </w:rPr>
-              <w:instrText xml:space="preserve"> PAGEREF _Toc120402832 \h </w:instrText>
+              <w:instrText xml:space="preserve"> PAGEREF _Toc120460910 \h </w:instrText>
             </w:r>
             <w:r>
               <w:rPr>
@@ -1015,7 +1013,7 @@
               <w:lang w:val="en-US" w:eastAsia="en-US"/>
             </w:rPr>
           </w:pPr>
-          <w:hyperlink w:anchor="_Toc120402833" w:history="1">
+          <w:hyperlink w:anchor="_Toc120460911" w:history="1">
             <w:r>
               <w:rPr>
                 <w:rStyle w:val="Hyperlink"/>
@@ -1043,7 +1041,7 @@
                 <w:noProof/>
                 <w:webHidden/>
               </w:rPr>
-              <w:instrText xml:space="preserve"> PAGEREF _Toc120402833 \h </w:instrText>
+              <w:instrText xml:space="preserve"> PAGEREF _Toc120460911 \h </w:instrText>
             </w:r>
             <w:r>
               <w:rPr>
@@ -1085,7 +1083,7 @@
               <w:lang w:val="en-US" w:eastAsia="en-US"/>
             </w:rPr>
           </w:pPr>
-          <w:hyperlink w:anchor="_Toc120402834" w:history="1">
+          <w:hyperlink w:anchor="_Toc120460912" w:history="1">
             <w:r>
               <w:rPr>
                 <w:rStyle w:val="Hyperlink"/>
@@ -1113,7 +1111,7 @@
                 <w:noProof/>
                 <w:webHidden/>
               </w:rPr>
-              <w:instrText xml:space="preserve"> PAGEREF _Toc120402834 \h </w:instrText>
+              <w:instrText xml:space="preserve"> PAGEREF _Toc120460912 \h </w:instrText>
             </w:r>
             <w:r>
               <w:rPr>
@@ -1157,7 +1155,7 @@
               <w:lang w:val="en-US"/>
             </w:rPr>
           </w:pPr>
-          <w:hyperlink w:anchor="_Toc120402835" w:history="1">
+          <w:hyperlink w:anchor="_Toc120460913" w:history="1">
             <w:r>
               <w:rPr>
                 <w:rStyle w:val="Hyperlink"/>
@@ -1184,7 +1182,7 @@
                 <w:noProof/>
                 <w:webHidden/>
               </w:rPr>
-              <w:instrText xml:space="preserve"> PAGEREF _Toc120402835 \h </w:instrText>
+              <w:instrText xml:space="preserve"> PAGEREF _Toc120460913 \h </w:instrText>
             </w:r>
             <w:r>
               <w:rPr>
@@ -1226,7 +1224,7 @@
               <w:lang w:val="en-US" w:eastAsia="en-US"/>
             </w:rPr>
           </w:pPr>
-          <w:hyperlink w:anchor="_Toc120402836" w:history="1">
+          <w:hyperlink w:anchor="_Toc120460914" w:history="1">
             <w:r>
               <w:rPr>
                 <w:rStyle w:val="Hyperlink"/>
@@ -1253,7 +1251,7 @@
                 <w:noProof/>
                 <w:webHidden/>
               </w:rPr>
-              <w:instrText xml:space="preserve"> PAGEREF _Toc120402836 \h </w:instrText>
+              <w:instrText xml:space="preserve"> PAGEREF _Toc120460914 \h </w:instrText>
             </w:r>
             <w:r>
               <w:rPr>
@@ -1295,7 +1293,7 @@
               <w:lang w:val="en-US" w:eastAsia="en-US"/>
             </w:rPr>
           </w:pPr>
-          <w:hyperlink w:anchor="_Toc120402837" w:history="1">
+          <w:hyperlink w:anchor="_Toc120460915" w:history="1">
             <w:r>
               <w:rPr>
                 <w:rStyle w:val="Hyperlink"/>
@@ -1322,7 +1320,7 @@
                 <w:noProof/>
                 <w:webHidden/>
               </w:rPr>
-              <w:instrText xml:space="preserve"> PAGEREF _Toc120402837 \h </w:instrText>
+              <w:instrText xml:space="preserve"> PAGEREF _Toc120460915 \h </w:instrText>
             </w:r>
             <w:r>
               <w:rPr>
@@ -1364,7 +1362,7 @@
               <w:lang w:val="en-US" w:eastAsia="en-US"/>
             </w:rPr>
           </w:pPr>
-          <w:hyperlink w:anchor="_Toc120402838" w:history="1">
+          <w:hyperlink w:anchor="_Toc120460916" w:history="1">
             <w:r>
               <w:rPr>
                 <w:rStyle w:val="Hyperlink"/>
@@ -1391,7 +1389,7 @@
                 <w:noProof/>
                 <w:webHidden/>
               </w:rPr>
-              <w:instrText xml:space="preserve"> PAGEREF _Toc120402838 \h </w:instrText>
+              <w:instrText xml:space="preserve"> PAGEREF _Toc120460916 \h </w:instrText>
             </w:r>
             <w:r>
               <w:rPr>
@@ -1433,7 +1431,7 @@
               <w:lang w:val="en-US" w:eastAsia="en-US"/>
             </w:rPr>
           </w:pPr>
-          <w:hyperlink w:anchor="_Toc120402839" w:history="1">
+          <w:hyperlink w:anchor="_Toc120460917" w:history="1">
             <w:r>
               <w:rPr>
                 <w:rStyle w:val="Hyperlink"/>
@@ -1460,7 +1458,7 @@
                 <w:noProof/>
                 <w:webHidden/>
               </w:rPr>
-              <w:instrText xml:space="preserve"> PAGEREF _Toc120402839 \h </w:instrText>
+              <w:instrText xml:space="preserve"> PAGEREF _Toc120460917 \h </w:instrText>
             </w:r>
             <w:r>
               <w:rPr>
@@ -1502,7 +1500,7 @@
               <w:lang w:val="en-US" w:eastAsia="en-US"/>
             </w:rPr>
           </w:pPr>
-          <w:hyperlink w:anchor="_Toc120402840" w:history="1">
+          <w:hyperlink w:anchor="_Toc120460918" w:history="1">
             <w:r>
               <w:rPr>
                 <w:rStyle w:val="Hyperlink"/>
@@ -1529,7 +1527,7 @@
                 <w:noProof/>
                 <w:webHidden/>
               </w:rPr>
-              <w:instrText xml:space="preserve"> PAGEREF _Toc120402840 \h </w:instrText>
+              <w:instrText xml:space="preserve"> PAGEREF _Toc120460918 \h </w:instrText>
             </w:r>
             <w:r>
               <w:rPr>
@@ -1571,7 +1569,7 @@
               <w:lang w:val="en-US" w:eastAsia="en-US"/>
             </w:rPr>
           </w:pPr>
-          <w:hyperlink w:anchor="_Toc120402841" w:history="1">
+          <w:hyperlink w:anchor="_Toc120460919" w:history="1">
             <w:r>
               <w:rPr>
                 <w:rStyle w:val="Hyperlink"/>
@@ -1599,7 +1597,7 @@
                 <w:noProof/>
                 <w:webHidden/>
               </w:rPr>
-              <w:instrText xml:space="preserve"> PAGEREF _Toc120402841 \h </w:instrText>
+              <w:instrText xml:space="preserve"> PAGEREF _Toc120460919 \h </w:instrText>
             </w:r>
             <w:r>
               <w:rPr>
@@ -1666,7 +1664,7 @@
           <w:lang w:val="ru-RU"/>
         </w:rPr>
       </w:pPr>
-      <w:bookmarkStart w:id="0" w:name="_Toc120402825"/>
+      <w:bookmarkStart w:id="0" w:name="_Toc120460903"/>
       <w:r>
         <w:rPr>
           <w:lang w:val="ru-RU"/>
@@ -1775,41 +1773,58 @@
         </w:rPr>
         <w:t xml:space="preserve">Данный документ распространяется под лицензией </w:t>
       </w:r>
-      <w:hyperlink r:id="rId9" w:history="1">
-        <w:r>
-          <w:rPr>
-            <w:rStyle w:val="Hyperlink"/>
-            <w:lang w:val="en-US"/>
-          </w:rPr>
-          <w:t>CC</w:t>
-        </w:r>
-        <w:r>
-          <w:rPr>
-            <w:rStyle w:val="Hyperlink"/>
-          </w:rPr>
-          <w:t xml:space="preserve">0 </w:t>
-        </w:r>
-        <w:r>
-          <w:rPr>
-            <w:rStyle w:val="Hyperlink"/>
-            <w:lang w:val="en-US"/>
-          </w:rPr>
-          <w:t>Public</w:t>
-        </w:r>
-        <w:r>
-          <w:rPr>
-            <w:rStyle w:val="Hyperlink"/>
-          </w:rPr>
-          <w:t xml:space="preserve"> </w:t>
-        </w:r>
-        <w:r>
-          <w:rPr>
-            <w:rStyle w:val="Hyperlink"/>
-            <w:lang w:val="en-US"/>
-          </w:rPr>
-          <w:t>License</w:t>
-        </w:r>
-      </w:hyperlink>
+      <w:r>
+        <w:fldChar w:fldCharType="begin"/>
+      </w:r>
+      <w:r>
+        <w:instrText xml:space="preserve"> HYPER</w:instrText>
+      </w:r>
+      <w:r>
+        <w:instrText xml:space="preserve">LINK "https://creativecommons.org/publicdomain/zero/1.0/" </w:instrText>
+      </w:r>
+      <w:r>
+        <w:fldChar w:fldCharType="separate"/>
+      </w:r>
+      <w:r>
+        <w:rPr>
+          <w:rStyle w:val="Hyperlink"/>
+          <w:lang w:val="en-US"/>
+        </w:rPr>
+        <w:t>CC</w:t>
+      </w:r>
+      <w:r>
+        <w:rPr>
+          <w:rStyle w:val="Hyperlink"/>
+        </w:rPr>
+        <w:t xml:space="preserve">0 </w:t>
+      </w:r>
+      <w:r>
+        <w:rPr>
+          <w:rStyle w:val="Hyperlink"/>
+          <w:lang w:val="en-US"/>
+        </w:rPr>
+        <w:t>Public</w:t>
+      </w:r>
+      <w:r>
+        <w:rPr>
+          <w:rStyle w:val="Hyperlink"/>
+        </w:rPr>
+        <w:t xml:space="preserve"> </w:t>
+      </w:r>
+      <w:r>
+        <w:rPr>
+          <w:rStyle w:val="Hyperlink"/>
+          <w:lang w:val="en-US"/>
+        </w:rPr>
+        <w:t>License</w:t>
+      </w:r>
+      <w:r>
+        <w:rPr>
+          <w:rStyle w:val="Hyperlink"/>
+          <w:lang w:val="en-US"/>
+        </w:rPr>
+        <w:fldChar w:fldCharType="end"/>
+      </w:r>
     </w:p>
     <w:p>
       <w:pPr>
@@ -1861,7 +1876,7 @@
           <w:lang w:val="ru-RU"/>
         </w:rPr>
       </w:pPr>
-      <w:bookmarkStart w:id="1" w:name="_Toc120402826"/>
+      <w:bookmarkStart w:id="1" w:name="_Toc120460904"/>
       <w:r>
         <w:rPr>
           <w:lang w:val="ru-RU"/>
@@ -1903,7 +1918,28 @@
         <w:rPr>
           <w:lang w:val="ru-RU"/>
         </w:rPr>
-        <w:t>Принадлежность к списку определялась путем программного морфологическо-эвристическому анализу текстов некрологов. Поэтому, кое-где могут быть неточности. Все данные отсортированы в алфавитном порядке.</w:t>
+        <w:t>Принадлежность к списку определялась путем программного морфологическо-эвристическо</w:t>
+      </w:r>
+      <w:r>
+        <w:t>го</w:t>
+      </w:r>
+      <w:r>
+        <w:rPr>
+          <w:lang w:val="ru-RU"/>
+        </w:rPr>
+        <w:t xml:space="preserve"> анализ</w:t>
+      </w:r>
+      <w:r>
+        <w:rPr>
+          <w:lang w:val="ru-RU"/>
+        </w:rPr>
+        <w:t>а</w:t>
+      </w:r>
+      <w:r>
+        <w:rPr>
+          <w:lang w:val="ru-RU"/>
+        </w:rPr>
+        <w:t xml:space="preserve"> текстов некрологов. Поэтому, кое-где могут быть неточности. Все данные отсортированы в алфавитном порядке.</w:t>
       </w:r>
       <w:r>
         <w:rPr>
@@ -1919,7 +1955,7 @@
           <w:lang w:val="ru-RU"/>
         </w:rPr>
       </w:pPr>
-      <w:bookmarkStart w:id="2" w:name="_Toc120402827"/>
+      <w:bookmarkStart w:id="2" w:name="_Toc120460905"/>
       <w:r>
         <w:rPr>
           <w:lang w:val="ru-RU"/>
@@ -1933,7 +1969,7 @@
       <w:pPr>
         <w:pStyle w:val="Heading2"/>
       </w:pPr>
-      <w:bookmarkStart w:id="3" w:name="_Toc120402828"/>
+      <w:bookmarkStart w:id="3" w:name="_Toc120460906"/>
       <w:r>
         <w:t>Кятвиртис Андрюс Далюсович</w:t>
       </w:r>
@@ -1949,7 +1985,7 @@
           <w:lang w:val="ru-RU"/>
         </w:rPr>
       </w:pPr>
-      <w:bookmarkStart w:id="4" w:name="_Toc120402829"/>
+      <w:bookmarkStart w:id="4" w:name="_Toc120460907"/>
       <w:r>
         <w:rPr>
           <w:lang w:val="ru-RU"/>
@@ -2013,7 +2049,7 @@
                           </pic:cNvPicPr>
                         </pic:nvPicPr>
                         <pic:blipFill>
-                          <a:blip r:embed="rId10" cstate="print">
+                          <a:blip r:embed="rId9" cstate="print">
                             <a:extLst>
                               <a:ext uri="{28A0092B-C50C-407E-A947-70E740481C1C}">
                                 <a14:useLocalDpi xmlns:a14="http://schemas.microsoft.com/office/drawing/2010/main" val="0"/>
@@ -2738,7 +2774,7 @@
           <w:lang w:val="ru-RU"/>
         </w:rPr>
       </w:pPr>
-      <w:bookmarkStart w:id="5" w:name="_Toc120402830"/>
+      <w:bookmarkStart w:id="5" w:name="_Toc120460908"/>
       <w:r>
         <w:rPr>
           <w:lang w:val="ru-RU"/>
@@ -2790,7 +2826,7 @@
                     </pic:cNvPicPr>
                   </pic:nvPicPr>
                   <pic:blipFill>
-                    <a:blip r:embed="rId11" cstate="print">
+                    <a:blip r:embed="rId10" cstate="print">
                       <a:extLst>
                         <a:ext uri="{28A0092B-C50C-407E-A947-70E740481C1C}">
                           <a14:useLocalDpi xmlns:a14="http://schemas.microsoft.com/office/drawing/2010/main" val="0"/>
@@ -2832,7 +2868,7 @@
       <w:pPr>
         <w:pStyle w:val="Heading3"/>
       </w:pPr>
-      <w:bookmarkStart w:id="6" w:name="_Toc120402831"/>
+      <w:bookmarkStart w:id="6" w:name="_Toc120460909"/>
       <w:r>
         <w:lastRenderedPageBreak/>
         <w:t>Метки</w:t>
@@ -2856,7 +2892,7 @@
       <w:pPr>
         <w:pStyle w:val="Heading3"/>
       </w:pPr>
-      <w:bookmarkStart w:id="7" w:name="_Toc120402832"/>
+      <w:bookmarkStart w:id="7" w:name="_Toc120460910"/>
       <w:r>
         <w:t>Социальные сети</w:t>
       </w:r>
@@ -2868,7 +2904,7 @@
       </w:r>
     </w:p>
     <w:p>
-      <w:hyperlink r:id="rId12" w:history="1">
+      <w:hyperlink r:id="rId11" w:history="1">
         <w:r>
           <w:rPr>
             <w:rStyle w:val="Hyperlink"/>
@@ -2883,7 +2919,7 @@
       </w:r>
     </w:p>
     <w:p>
-      <w:hyperlink r:id="rId13" w:history="1">
+      <w:hyperlink r:id="rId12" w:history="1">
         <w:r>
           <w:rPr>
             <w:rStyle w:val="Hyperlink"/>
@@ -2898,7 +2934,7 @@
       </w:r>
     </w:p>
     <w:p>
-      <w:hyperlink r:id="rId14" w:history="1">
+      <w:hyperlink r:id="rId13" w:history="1">
         <w:r>
           <w:rPr>
             <w:rStyle w:val="Hyperlink"/>
@@ -2913,7 +2949,7 @@
       </w:r>
     </w:p>
     <w:p>
-      <w:hyperlink r:id="rId15" w:history="1">
+      <w:hyperlink r:id="rId14" w:history="1">
         <w:r>
           <w:rPr>
             <w:rStyle w:val="Hyperlink"/>
@@ -2930,7 +2966,7 @@
           <w:lang w:val="ru-RU"/>
         </w:rPr>
       </w:pPr>
-      <w:bookmarkStart w:id="8" w:name="_Toc120402833"/>
+      <w:bookmarkStart w:id="8" w:name="_Toc120460911"/>
       <w:r>
         <w:rPr>
           <w:lang w:val="ru-RU"/>
@@ -2945,7 +2981,7 @@
           <w:lang w:val="ru-RU"/>
         </w:rPr>
       </w:pPr>
-      <w:hyperlink r:id="rId16" w:history="1">
+      <w:hyperlink r:id="rId15" w:history="1">
         <w:r>
           <w:rPr>
             <w:rStyle w:val="Hyperlink"/>
@@ -2961,7 +2997,7 @@
           <w:lang w:val="ru-RU"/>
         </w:rPr>
       </w:pPr>
-      <w:hyperlink r:id="rId17" w:history="1">
+      <w:hyperlink r:id="rId16" w:history="1">
         <w:r>
           <w:rPr>
             <w:rStyle w:val="Hyperlink"/>
@@ -2977,7 +3013,7 @@
           <w:lang w:val="ru-RU"/>
         </w:rPr>
       </w:pPr>
-      <w:hyperlink r:id="rId18" w:history="1">
+      <w:hyperlink r:id="rId17" w:history="1">
         <w:r>
           <w:rPr>
             <w:rStyle w:val="Hyperlink"/>
@@ -2993,7 +3029,7 @@
           <w:lang w:val="ru-RU"/>
         </w:rPr>
       </w:pPr>
-      <w:hyperlink r:id="rId19" w:history="1">
+      <w:hyperlink r:id="rId18" w:history="1">
         <w:r>
           <w:rPr>
             <w:rStyle w:val="Hyperlink"/>
@@ -3009,7 +3045,7 @@
           <w:lang w:val="ru-RU"/>
         </w:rPr>
       </w:pPr>
-      <w:hyperlink r:id="rId20" w:history="1">
+      <w:hyperlink r:id="rId19" w:history="1">
         <w:r>
           <w:rPr>
             <w:rStyle w:val="Hyperlink"/>
@@ -3025,7 +3061,7 @@
           <w:lang w:val="ru-RU"/>
         </w:rPr>
       </w:pPr>
-      <w:hyperlink r:id="rId21" w:history="1">
+      <w:hyperlink r:id="rId20" w:history="1">
         <w:r>
           <w:rPr>
             <w:rStyle w:val="Hyperlink"/>
@@ -3043,7 +3079,7 @@
           <w:lang w:val="en-US"/>
         </w:rPr>
       </w:pPr>
-      <w:bookmarkStart w:id="9" w:name="_Toc120402834"/>
+      <w:bookmarkStart w:id="9" w:name="_Toc120460912"/>
       <w:r>
         <w:rPr>
           <w:lang w:val="en-US"/>
@@ -3100,7 +3136,7 @@
                 <w:lang w:val="ru-RU"/>
               </w:rPr>
             </w:pPr>
-            <w:hyperlink r:id="rId22" w:history="1">
+            <w:hyperlink r:id="rId21" w:history="1">
               <w:r>
                 <w:rPr>
                   <w:rStyle w:val="Hyperlink"/>
@@ -3129,6 +3165,7 @@
                 </w:rPr>
                 <w:t>.</w:t>
               </w:r>
+              <w:proofErr w:type="spellStart"/>
               <w:r>
                 <w:rPr>
                   <w:rStyle w:val="Hyperlink"/>
@@ -3136,6 +3173,7 @@
                 </w:rPr>
                 <w:t>facebook</w:t>
               </w:r>
+              <w:proofErr w:type="spellEnd"/>
               <w:r>
                 <w:rPr>
                   <w:rStyle w:val="Hyperlink"/>
@@ -3157,6 +3195,7 @@
                 </w:rPr>
                 <w:t>/</w:t>
               </w:r>
+              <w:proofErr w:type="spellStart"/>
               <w:r>
                 <w:rPr>
                   <w:rStyle w:val="Hyperlink"/>
@@ -3164,6 +3203,7 @@
                 </w:rPr>
                 <w:t>irakli</w:t>
               </w:r>
+              <w:proofErr w:type="spellEnd"/>
               <w:r>
                 <w:rPr>
                   <w:rStyle w:val="Hyperlink"/>
@@ -3171,6 +3211,7 @@
                 </w:rPr>
                 <w:t>.</w:t>
               </w:r>
+              <w:proofErr w:type="spellStart"/>
               <w:r>
                 <w:rPr>
                   <w:rStyle w:val="Hyperlink"/>
@@ -3178,6 +3219,7 @@
                 </w:rPr>
                 <w:t>komaxidze</w:t>
               </w:r>
+              <w:proofErr w:type="spellEnd"/>
               <w:r>
                 <w:rPr>
                   <w:rStyle w:val="Hyperlink"/>
@@ -3199,6 +3241,7 @@
                 </w:rPr>
                 <w:t>/</w:t>
               </w:r>
+              <w:proofErr w:type="spellStart"/>
               <w:r>
                 <w:rPr>
                   <w:rStyle w:val="Hyperlink"/>
@@ -3206,6 +3249,7 @@
                 </w:rPr>
                 <w:t>pfbid</w:t>
               </w:r>
+              <w:proofErr w:type="spellEnd"/>
               <w:r>
                 <w:rPr>
                   <w:rStyle w:val="Hyperlink"/>
@@ -3213,6 +3257,7 @@
                 </w:rPr>
                 <w:t>02</w:t>
               </w:r>
+              <w:proofErr w:type="spellStart"/>
               <w:r>
                 <w:rPr>
                   <w:rStyle w:val="Hyperlink"/>
@@ -3220,6 +3265,7 @@
                 </w:rPr>
                 <w:t>rEu</w:t>
               </w:r>
+              <w:proofErr w:type="spellEnd"/>
               <w:r>
                 <w:rPr>
                   <w:rStyle w:val="Hyperlink"/>
@@ -3255,6 +3301,7 @@
                 </w:rPr>
                 <w:t>4</w:t>
               </w:r>
+              <w:proofErr w:type="spellStart"/>
               <w:r>
                 <w:rPr>
                   <w:rStyle w:val="Hyperlink"/>
@@ -3262,6 +3309,7 @@
                 </w:rPr>
                 <w:t>kGJNjPQ</w:t>
               </w:r>
+              <w:proofErr w:type="spellEnd"/>
               <w:r>
                 <w:rPr>
                   <w:rStyle w:val="Hyperlink"/>
@@ -3269,6 +3317,7 @@
                 </w:rPr>
                 <w:t>1</w:t>
               </w:r>
+              <w:proofErr w:type="spellStart"/>
               <w:r>
                 <w:rPr>
                   <w:rStyle w:val="Hyperlink"/>
@@ -3276,6 +3325,7 @@
                 </w:rPr>
                 <w:t>GDXGrZb</w:t>
               </w:r>
+              <w:proofErr w:type="spellEnd"/>
               <w:r>
                 <w:rPr>
                   <w:rStyle w:val="Hyperlink"/>
@@ -3283,6 +3333,7 @@
                 </w:rPr>
                 <w:t>9</w:t>
               </w:r>
+              <w:proofErr w:type="spellStart"/>
               <w:r>
                 <w:rPr>
                   <w:rStyle w:val="Hyperlink"/>
@@ -3290,6 +3341,7 @@
                 </w:rPr>
                 <w:t>VvzLkyhtJ</w:t>
               </w:r>
+              <w:proofErr w:type="spellEnd"/>
               <w:r>
                 <w:rPr>
                   <w:rStyle w:val="Hyperlink"/>
@@ -3297,6 +3349,7 @@
                 </w:rPr>
                 <w:t>52</w:t>
               </w:r>
+              <w:proofErr w:type="spellStart"/>
               <w:r>
                 <w:rPr>
                   <w:rStyle w:val="Hyperlink"/>
@@ -3304,6 +3357,7 @@
                 </w:rPr>
                 <w:t>hReEGtTh</w:t>
               </w:r>
+              <w:proofErr w:type="spellEnd"/>
               <w:r>
                 <w:rPr>
                   <w:rStyle w:val="Hyperlink"/>
@@ -3325,6 +3379,7 @@
                 </w:rPr>
                 <w:t>7</w:t>
               </w:r>
+              <w:proofErr w:type="spellStart"/>
               <w:r>
                 <w:rPr>
                   <w:rStyle w:val="Hyperlink"/>
@@ -3332,6 +3387,7 @@
                 </w:rPr>
                 <w:t>BBBuiBLVQ</w:t>
               </w:r>
+              <w:proofErr w:type="spellEnd"/>
               <w:r>
                 <w:rPr>
                   <w:rStyle w:val="Hyperlink"/>
@@ -3339,6 +3395,7 @@
                 </w:rPr>
                 <w:t>3</w:t>
               </w:r>
+              <w:proofErr w:type="spellStart"/>
               <w:r>
                 <w:rPr>
                   <w:rStyle w:val="Hyperlink"/>
@@ -3346,6 +3403,7 @@
                 </w:rPr>
                 <w:t>BWWao</w:t>
               </w:r>
+              <w:proofErr w:type="spellEnd"/>
               <w:r>
                 <w:rPr>
                   <w:rStyle w:val="Hyperlink"/>
@@ -3370,7 +3428,7 @@
             </w:pPr>
           </w:p>
           <w:p>
-            <w:hyperlink r:id="rId23" w:history="1">
+            <w:hyperlink r:id="rId22" w:history="1">
               <w:r>
                 <w:rPr>
                   <w:rStyle w:val="Hyperlink"/>
@@ -3405,7 +3463,7 @@
             <w:tcW w:w="6938" w:type="dxa"/>
           </w:tcPr>
           <w:p>
-            <w:hyperlink r:id="rId24" w:history="1">
+            <w:hyperlink r:id="rId23" w:history="1">
               <w:r>
                 <w:rPr>
                   <w:rStyle w:val="Hyperlink"/>
@@ -3431,8 +3489,16 @@
               <w:rPr>
                 <w:lang w:val="en-US"/>
               </w:rPr>
-              <w:t>Necro Mancer</w:t>
-            </w:r>
+              <w:t xml:space="preserve">Necro </w:t>
+            </w:r>
+            <w:proofErr w:type="spellStart"/>
+            <w:r>
+              <w:rPr>
+                <w:lang w:val="en-US"/>
+              </w:rPr>
+              <w:t>Mancer</w:t>
+            </w:r>
+            <w:proofErr w:type="spellEnd"/>
           </w:p>
         </w:tc>
         <w:tc>
@@ -3445,7 +3511,7 @@
                 <w:lang w:val="en-US"/>
               </w:rPr>
             </w:pPr>
-            <w:hyperlink r:id="rId25" w:history="1">
+            <w:hyperlink r:id="rId24" w:history="1">
               <w:r>
                 <w:rPr>
                   <w:rStyle w:val="Hyperlink"/>
@@ -3468,12 +3534,14 @@
                 <w:lang w:val="en-US"/>
               </w:rPr>
             </w:pPr>
+            <w:proofErr w:type="spellStart"/>
             <w:r>
               <w:rPr>
                 <w:lang w:val="en-US"/>
               </w:rPr>
               <w:t>Timenote</w:t>
             </w:r>
+            <w:proofErr w:type="spellEnd"/>
           </w:p>
         </w:tc>
         <w:tc>
@@ -3486,7 +3554,7 @@
                 <w:lang w:val="en-US"/>
               </w:rPr>
             </w:pPr>
-            <w:hyperlink r:id="rId26" w:history="1">
+            <w:hyperlink r:id="rId25" w:history="1">
               <w:r>
                 <w:rPr>
                   <w:rStyle w:val="Hyperlink"/>
@@ -3523,7 +3591,7 @@
       <w:pPr>
         <w:pStyle w:val="Heading2"/>
       </w:pPr>
-      <w:bookmarkStart w:id="10" w:name="_Toc120402835"/>
+      <w:bookmarkStart w:id="10" w:name="_Toc120460913"/>
       <w:r>
         <w:lastRenderedPageBreak/>
         <w:t>Серейчикас Эдвардас</w:t>
@@ -3537,7 +3605,7 @@
       <w:pPr>
         <w:pStyle w:val="Heading3"/>
       </w:pPr>
-      <w:bookmarkStart w:id="11" w:name="_Toc120402836"/>
+      <w:bookmarkStart w:id="11" w:name="_Toc120460914"/>
       <w:r>
         <w:t>Общая информация</w:t>
       </w:r>
@@ -3598,7 +3666,7 @@
                           </pic:cNvPicPr>
                         </pic:nvPicPr>
                         <pic:blipFill>
-                          <a:blip r:embed="rId27">
+                          <a:blip r:embed="rId26">
                             <a:extLst>
                               <a:ext uri="{28A0092B-C50C-407E-A947-70E740481C1C}">
                                 <a14:useLocalDpi xmlns:a14="http://schemas.microsoft.com/office/drawing/2010/main" val="0"/>
@@ -4290,7 +4358,7 @@
       <w:pPr>
         <w:pStyle w:val="Heading3"/>
       </w:pPr>
-      <w:bookmarkStart w:id="12" w:name="_Toc120402837"/>
+      <w:bookmarkStart w:id="12" w:name="_Toc120460915"/>
       <w:r>
         <w:t>Детальное фото</w:t>
       </w:r>
@@ -4327,7 +4395,7 @@
                     </pic:cNvPicPr>
                   </pic:nvPicPr>
                   <pic:blipFill>
-                    <a:blip r:embed="rId28" cstate="print">
+                    <a:blip r:embed="rId27" cstate="print">
                       <a:extLst>
                         <a:ext uri="{28A0092B-C50C-407E-A947-70E740481C1C}">
                           <a14:useLocalDpi xmlns:a14="http://schemas.microsoft.com/office/drawing/2010/main" val="0"/>
@@ -4366,7 +4434,7 @@
       <w:pPr>
         <w:pStyle w:val="Heading3"/>
       </w:pPr>
-      <w:bookmarkStart w:id="13" w:name="_Toc120402838"/>
+      <w:bookmarkStart w:id="13" w:name="_Toc120460916"/>
       <w:r>
         <w:lastRenderedPageBreak/>
         <w:t>Метки</w:t>
@@ -4392,7 +4460,7 @@
       <w:pPr>
         <w:pStyle w:val="Heading3"/>
       </w:pPr>
-      <w:bookmarkStart w:id="14" w:name="_Toc120402839"/>
+      <w:bookmarkStart w:id="14" w:name="_Toc120460917"/>
       <w:r>
         <w:t>Социальные сети</w:t>
       </w:r>
@@ -4404,7 +4472,7 @@
       </w:r>
     </w:p>
     <w:p>
-      <w:hyperlink r:id="rId29" w:history="1">
+      <w:hyperlink r:id="rId28" w:history="1">
         <w:r>
           <w:rPr>
             <w:rStyle w:val="Hyperlink"/>
@@ -4425,7 +4493,7 @@
       </w:r>
     </w:p>
     <w:p>
-      <w:hyperlink r:id="rId30" w:history="1">
+      <w:hyperlink r:id="rId29" w:history="1">
         <w:r>
           <w:rPr>
             <w:rStyle w:val="Hyperlink"/>
@@ -4443,7 +4511,7 @@
       </w:r>
     </w:p>
     <w:p>
-      <w:hyperlink r:id="rId31" w:history="1">
+      <w:hyperlink r:id="rId30" w:history="1">
         <w:r>
           <w:rPr>
             <w:rStyle w:val="Hyperlink"/>
@@ -4457,14 +4525,14 @@
       <w:pPr>
         <w:pStyle w:val="Heading3"/>
       </w:pPr>
-      <w:bookmarkStart w:id="15" w:name="_Toc120402840"/>
+      <w:bookmarkStart w:id="15" w:name="_Toc120460918"/>
       <w:r>
         <w:t>Некрологи</w:t>
       </w:r>
       <w:bookmarkEnd w:id="15"/>
     </w:p>
     <w:p>
-      <w:hyperlink r:id="rId32" w:history="1">
+      <w:hyperlink r:id="rId31" w:history="1">
         <w:r>
           <w:rPr>
             <w:rStyle w:val="Hyperlink"/>
@@ -4478,7 +4546,7 @@
       <w:pPr>
         <w:pStyle w:val="Heading3"/>
       </w:pPr>
-      <w:bookmarkStart w:id="16" w:name="_Toc120402841"/>
+      <w:bookmarkStart w:id="16" w:name="_Toc120460919"/>
       <w:r>
         <w:rPr>
           <w:lang w:val="en-US"/>
@@ -4530,7 +4598,7 @@
             <w:tcW w:w="6938" w:type="dxa"/>
           </w:tcPr>
           <w:p>
-            <w:hyperlink r:id="rId33" w:history="1">
+            <w:hyperlink r:id="rId32" w:history="1">
               <w:r>
                 <w:rPr>
                   <w:rStyle w:val="Hyperlink"/>
@@ -4565,7 +4633,7 @@
             <w:tcW w:w="6938" w:type="dxa"/>
           </w:tcPr>
           <w:p>
-            <w:hyperlink r:id="rId34" w:history="1">
+            <w:hyperlink r:id="rId33" w:history="1">
               <w:r>
                 <w:rPr>
                   <w:rStyle w:val="Hyperlink"/>
@@ -4591,8 +4659,16 @@
               <w:rPr>
                 <w:lang w:val="en-US"/>
               </w:rPr>
-              <w:t>Necro Mancer</w:t>
-            </w:r>
+              <w:t xml:space="preserve">Necro </w:t>
+            </w:r>
+            <w:proofErr w:type="spellStart"/>
+            <w:r>
+              <w:rPr>
+                <w:lang w:val="en-US"/>
+              </w:rPr>
+              <w:t>Mancer</w:t>
+            </w:r>
+            <w:proofErr w:type="spellEnd"/>
           </w:p>
         </w:tc>
         <w:tc>
@@ -4605,7 +4681,7 @@
                 <w:lang w:val="en-US"/>
               </w:rPr>
             </w:pPr>
-            <w:hyperlink r:id="rId35" w:history="1">
+            <w:hyperlink r:id="rId34" w:history="1">
               <w:r>
                 <w:rPr>
                   <w:rStyle w:val="Hyperlink"/>
@@ -4630,7 +4706,7 @@
       </w:pPr>
     </w:p>
     <w:sectPr>
-      <w:footerReference w:type="default" r:id="rId36"/>
+      <w:footerReference w:type="default" r:id="rId35"/>
       <w:pgSz w:w="11906" w:h="16838"/>
       <w:pgMar w:top="851" w:right="851" w:bottom="851" w:left="851" w:header="709" w:footer="709" w:gutter="0"/>
       <w:pgNumType w:start="0"/>

</xml_diff>